<commit_message>
T28: 2026 spelling (-owski lowercase, niekontrastujący) in Ndiaye, Pahulich, Tittel; Word copies re-exported in place (MB: none opened)
</commit_message>
<xml_diff>
--- a/work/ndiaye/ndiaye_robocza_v2.docx
+++ b/work/ndiaye/ndiaye_robocza_v2.docx
@@ -1349,7 +1349,7 @@
         <w:footnoteReference w:id="47"/>
       </w:r>
       <w:r>
-        <w:t xml:space="preserve">. Winieta Sallebraya czerpie zatem z sieci kinetycznych skojarzeń, zarówno rzeczywistych, jak i wyobrażonych, między tymi dwiema urasowionymi społecznościami. To tło historyczne skłania mnie do odczytywania wizualnego zestawienia romskiej tancerki i jej czarnej świty jako łączącego, a nie kontrastującego. Szczegół kajdan czarnych tancerzy zwraca uwagę na ich status zniewolonych i tym samym stawia kinetyczne powiązanie afroromskie pod znakiem zniewolenia i wspólnego pragnienia ruchu – rzeczywistego i symbolicznego – które zniewoleniu towarzyszy.</w:t>
+        <w:t xml:space="preserve">. Winieta Sallebraya czerpie zatem z sieci kinetycznych skojarzeń, zarówno rzeczywistych, jak i wyobrażonych, między tymi dwiema urasowionymi społecznościami. To tło historyczne skłania mnie do odczytywania wizualnego zestawienia romskiej tancerki i jej czarnej świty jako łączącego, a niekontrastującego. Szczegół kajdan czarnych tancerzy zwraca uwagę na ich status zniewolonych i tym samym stawia kinetyczne powiązanie afroromskie pod znakiem zniewolenia i wspólnego pragnienia ruchu – rzeczywistego i symbolicznego – które zniewoleniu towarzyszy.</w:t>
       </w:r>
     </w:p>
     <w:p>
@@ -1532,7 +1532,7 @@
         <w:t xml:space="preserve"> </w:t>
       </w:r>
       <w:r>
-        <w:t xml:space="preserve">pozwala nam dostrzec coś, co do dziś pozostawało niewidoczne: Molierowską eksplorację romskiej kondycji w ekonomii wczesnonowożytnej niewoli w</w:t>
+        <w:t xml:space="preserve">pozwala nam dostrzec coś, co do dziś pozostawało niewidoczne: molierowską eksplorację romskiej kondycji w ekonomii wczesnonowożytnej niewoli w</w:t>
       </w:r>
       <w:r>
         <w:t xml:space="preserve"> </w:t>
@@ -2060,7 +2060,7 @@
         <w:footnoteReference w:id="66"/>
       </w:r>
       <w:r>
-        <w:t xml:space="preserve">. Chodzi mi o to, że – zamierzenie czy nie (a rozróżnienie to ma niewielkie znaczenie, gdy uwaga skupia się na efekcie i recepcji) – Molierowski przekład</w:t>
+        <w:t xml:space="preserve">. Chodzi mi o to, że – zamierzenie czy nie (a rozróżnienie to ma niewielkie znaczenie, gdy uwaga skupia się na efekcie i recepcji) – molierowski przekład</w:t>
       </w:r>
       <w:r>
         <w:t xml:space="preserve"> </w:t>
@@ -2076,7 +2076,7 @@
         <w:t xml:space="preserve"> </w:t>
       </w:r>
       <w:r>
-        <w:t xml:space="preserve">przemienił fantazje o gadje przenikających do społeczności romskiej w ich przeciwieństwo: w fantazje o Romach przenikających do społeczności gadje. Dla czytelników obeznanych z fikcjonalizacją i dramatyzacją wczesnonowożytnych formacji rasowych Molierowski przekład noweli Cervantesa dla sceny francuskiej czyta się jak opowieść o uchodzeniu za białych.</w:t>
+        <w:t xml:space="preserve">przemienił fantazje o gadje przenikających do społeczności romskiej w ich przeciwieństwo: w fantazje o Romach przenikających do społeczności gadje. Dla czytelników obeznanych z fikcjonalizacją i dramatyzacją wczesnonowożytnych formacji rasowych molierowski przekład noweli Cervantesa dla sceny francuskiej czyta się jak opowieść o uchodzeniu za białych.</w:t>
       </w:r>
     </w:p>
     <w:p>
@@ -2597,7 +2597,7 @@
         <w:pStyle w:val="BodyText"/>
       </w:pPr>
       <w:r>
-        <w:t xml:space="preserve">W świetle tak trwałych przedstawień literackich i uporczywych wysiłków społecznych, by wtłoczyć Romów w kapitalistyczną machinę wywłaszczenia, odczytuję decyzję Edwarda Ravenscrofta o rozdzieleniu Molierowskiego Roma uchodzącego za białego na dwóch uzupełniających się</w:t>
+        <w:t xml:space="preserve">W świetle tak trwałych przedstawień literackich i uporczywych wysiłków społecznych, by wtłoczyć Romów w kapitalistyczną machinę wywłaszczenia, odczytuję decyzję Edwarda Ravenscrofta o rozdzieleniu molierowskiego Roma uchodzącego za białego na dwóch uzupełniających się</w:t>
       </w:r>
       <w:r>
         <w:t xml:space="preserve"> </w:t>
@@ -2619,7 +2619,7 @@
         <w:footnoteReference w:id="90"/>
       </w:r>
       <w:r>
-        <w:t xml:space="preserve">. Tak jak romski wymiar Molierowskiego Skapena staje się bardziej widoczny, gdy czytamy go w dialogu z całą twórczością Moliera (w tym z</w:t>
+        <w:t xml:space="preserve">. Tak jak romski wymiar molierowskiego Skapena staje się bardziej widoczny, gdy czytamy go w dialogu z całą twórczością Moliera (w tym z</w:t>
       </w:r>
       <w:r>
         <w:t xml:space="preserve"> </w:t>
@@ -5634,7 +5634,7 @@
         <w:t xml:space="preserve">[@molier1922]</w:t>
       </w:r>
       <w:r>
-        <w:t xml:space="preserve"> </w:t>
+        <w:t xml:space="preserve">;</w:t>
       </w:r>
       <w:commentRangeStart w:id="2"/>
       <w:commentRangeEnd w:id="2"/>
@@ -5645,7 +5645,10 @@
         <w:commentReference w:id="2"/>
       </w:r>
       <w:r>
-        <w:t xml:space="preserve">; oryginał: „Une bande de ces personnes, qu’on appelle Égyptiens, et qui rôdant de province en province, se mêlent de dire la bonne fortune, et quelquefois de beaucoup d’autres choses”:</w:t>
+        <w:t xml:space="preserve"> </w:t>
+      </w:r>
+      <w:r>
+        <w:t xml:space="preserve">oryginał: „Une bande de ces personnes, qu’on appelle Égyptiens, et qui rôdant de province en province, se mêlent de dire la bonne fortune, et quelquefois de beaucoup d’autres choses”:</w:t>
       </w:r>
       <w:r>
         <w:t xml:space="preserve"> </w:t>
@@ -5756,7 +5759,7 @@
         <w:t xml:space="preserve">[@molier1922]</w:t>
       </w:r>
       <w:r>
-        <w:t xml:space="preserve"> </w:t>
+        <w:t xml:space="preserve">;</w:t>
       </w:r>
       <w:commentRangeStart w:id="3"/>
       <w:commentRangeEnd w:id="3"/>
@@ -5767,7 +5770,10 @@
         <w:commentReference w:id="3"/>
       </w:r>
       <w:r>
-        <w:t xml:space="preserve">; oryginał: „Un petit démêlé avec la justice […] elle en usa fort mal avec moi”:</w:t>
+        <w:t xml:space="preserve"> </w:t>
+      </w:r>
+      <w:r>
+        <w:t xml:space="preserve">oryginał: „Un petit démêlé avec la justice […] elle en usa fort mal avec moi”:</w:t>
       </w:r>
       <w:r>
         <w:t xml:space="preserve"> </w:t>
@@ -5798,7 +5804,7 @@
         <w:t xml:space="preserve">[@molier1922]</w:t>
       </w:r>
       <w:r>
-        <w:t xml:space="preserve"> </w:t>
+        <w:t xml:space="preserve">;</w:t>
       </w:r>
       <w:commentRangeStart w:id="4"/>
       <w:commentRangeEnd w:id="4"/>
@@ -5809,7 +5815,10 @@
         <w:commentReference w:id="4"/>
       </w:r>
       <w:r>
-        <w:t xml:space="preserve">; oryginał: „Trois ans de galère de plus, ou de moins, ne sont pas pour arrêter un noble cœur”:</w:t>
+        <w:t xml:space="preserve"> </w:t>
+      </w:r>
+      <w:r>
+        <w:t xml:space="preserve">oryginał: „Trois ans de galère de plus, ou de moins, ne sont pas pour arrêter un noble cœur”:</w:t>
       </w:r>
       <w:r>
         <w:t xml:space="preserve"> </w:t>
@@ -6338,7 +6347,7 @@
         <w:t xml:space="preserve">[@molier1922]</w:t>
       </w:r>
       <w:r>
-        <w:t xml:space="preserve"> </w:t>
+        <w:t xml:space="preserve">;</w:t>
       </w:r>
       <w:commentRangeStart w:id="5"/>
       <w:commentRangeEnd w:id="5"/>
@@ -6349,44 +6358,41 @@
         <w:commentReference w:id="5"/>
       </w:r>
       <w:r>
+        <w:t xml:space="preserve"> </w:t>
+      </w:r>
+      <w:r>
+        <w:t xml:space="preserve">[@moliere1671, s. 97]</w:t>
+      </w:r>
+      <w:r>
+        <w:t xml:space="preserve">. [W oryginale: „En voici un autre qui a la mine d’un étranger” („Oto następny, który wygląda na cudzoziemca”); przekład Boya-Żeleńskiego nie zachowuje cudzoziemca, na którym opiera się wywód autorki – przyp. tłum.]</w:t>
+      </w:r>
+    </w:p>
+  </w:footnote>
+  <w:footnote w:id="79">
+    <w:p>
+      <w:pPr>
+        <w:pStyle w:val="FootnoteText"/>
+      </w:pPr>
+      <w:r>
+        <w:rPr>
+          <w:rStyle w:val="FootnoteReference"/>
+        </w:rPr>
+        <w:footnoteRef/>
+      </w:r>
+      <w:r>
+        <w:t xml:space="preserve"> </w:t>
+      </w:r>
+      <w:r>
+        <w:t xml:space="preserve">„Nie ma pomiędzy nim a panem ani cienia podobieństwa; wiadomo panu zresztą, iż nie brak ludzi, którzy twierdzą, że on jest ojcem twoim jedynie w sensie formalnym”:</w:t>
+      </w:r>
+      <w:r>
+        <w:t xml:space="preserve"> </w:t>
+      </w:r>
+      <w:r>
+        <w:t xml:space="preserve">[@molier1922]</w:t>
+      </w:r>
+      <w:r>
         <w:t xml:space="preserve">;</w:t>
-      </w:r>
-      <w:r>
-        <w:t xml:space="preserve"> </w:t>
-      </w:r>
-      <w:r>
-        <w:t xml:space="preserve">[@moliere1671, s. 97]</w:t>
-      </w:r>
-      <w:r>
-        <w:t xml:space="preserve">. [W oryginale: „En voici un autre qui a la mine d’un étranger” („Oto następny, który wygląda na cudzoziemca”); przekład Boya-Żeleńskiego nie zachowuje cudzoziemca, na którym opiera się wywód autorki – przyp. tłum.]</w:t>
-      </w:r>
-    </w:p>
-  </w:footnote>
-  <w:footnote w:id="79">
-    <w:p>
-      <w:pPr>
-        <w:pStyle w:val="FootnoteText"/>
-      </w:pPr>
-      <w:r>
-        <w:rPr>
-          <w:rStyle w:val="FootnoteReference"/>
-        </w:rPr>
-        <w:footnoteRef/>
-      </w:r>
-      <w:r>
-        <w:t xml:space="preserve"> </w:t>
-      </w:r>
-      <w:r>
-        <w:t xml:space="preserve">„Nie ma pomiędzy nim a panem ani cienia podobieństwa; wiadomo panu zresztą, iż nie brak ludzi, którzy twierdzą, że on jest ojcem twoim jedynie w sensie formalnym”:</w:t>
-      </w:r>
-      <w:r>
-        <w:t xml:space="preserve"> </w:t>
-      </w:r>
-      <w:r>
-        <w:t xml:space="preserve">[@molier1922]</w:t>
-      </w:r>
-      <w:r>
-        <w:t xml:space="preserve"> </w:t>
       </w:r>
       <w:commentRangeStart w:id="6"/>
       <w:commentRangeEnd w:id="6"/>
@@ -6397,9 +6403,6 @@
         <w:commentReference w:id="6"/>
       </w:r>
       <w:r>
-        <w:t xml:space="preserve">;</w:t>
-      </w:r>
-      <w:r>
         <w:t xml:space="preserve"> </w:t>
       </w:r>
       <w:r>
@@ -6444,7 +6447,7 @@
         <w:t xml:space="preserve"> </w:t>
       </w:r>
       <w:r>
-        <w:t xml:space="preserve">(prapremiera 1655), pierwszej Molierowskiej adaptacji</w:t>
+        <w:t xml:space="preserve">(prapremiera 1655), pierwszej molierowskiej adaptacji</w:t>
       </w:r>
       <w:r>
         <w:t xml:space="preserve"> </w:t>
@@ -6523,7 +6526,7 @@
         <w:t xml:space="preserve">[@vanlennep1965, s. 256]</w:t>
       </w:r>
       <w:r>
-        <w:t xml:space="preserve">. Jego decyzja o włączeniu Skaramusza do przeróbki Molierowskiego</w:t>
+        <w:t xml:space="preserve">. Jego decyzja o włączeniu Skaramusza do przeróbki molierowskiego</w:t>
       </w:r>
       <w:r>
         <w:t xml:space="preserve"> </w:t>

</xml_diff>

<commit_message>
Apply review 02.10.2026: unnumbered headings, translator annotations withdrawn (T31, T33), Kanon v1.15, _v2 master test (T30)
Co-Authored-By: Claude Sonnet 5.5 <noreply@anthropic.com>
</commit_message>
<xml_diff>
--- a/work/ndiaye/ndiaye_robocza_v2.docx
+++ b/work/ndiaye/ndiaye_robocza_v2.docx
@@ -36,7 +36,7 @@
         <w:pStyle w:val="Heading1"/>
       </w:pPr>
       <w:r>
-        <w:t xml:space="preserve">1. WSTĘP</w:t>
+        <w:t xml:space="preserve">WSTĘP</w:t>
       </w:r>
     </w:p>
     <w:p>
@@ -548,7 +548,7 @@
         <w:pStyle w:val="Heading1"/>
       </w:pPr>
       <w:r>
-        <w:t xml:space="preserve">2. BEZ KOTWICY: ROMSKA AFRYKA W WYOBRAŹNI EUROPEJSKIEJ</w:t>
+        <w:t xml:space="preserve">BEZ KOTWICY: ROMSKA AFRYKA W WYOBRAŹNI EUROPEJSKIEJ</w:t>
       </w:r>
     </w:p>
     <w:p>
@@ -1182,7 +1182,7 @@
         <w:pStyle w:val="Heading1"/>
       </w:pPr>
       <w:r>
-        <w:t xml:space="preserve">3. WIĘZI W NIEWOLI</w:t>
+        <w:t xml:space="preserve">WIĘZI W NIEWOLI</w:t>
       </w:r>
     </w:p>
     <w:p>
@@ -1553,7 +1553,7 @@
         <w:pStyle w:val="Heading1"/>
       </w:pPr>
       <w:r>
-        <w:t xml:space="preserve">4. FIKCJE UCHODZENIA ZA BIAŁYCH W</w:t>
+        <w:t xml:space="preserve">FIKCJE UCHODZENIA ZA BIAŁYCH W</w:t>
       </w:r>
       <w:r>
         <w:t xml:space="preserve"> </w:t>
@@ -2388,7 +2388,7 @@
         <w:pStyle w:val="Heading1"/>
       </w:pPr>
       <w:r>
-        <w:t xml:space="preserve">5. ARLEKIN RAVENSCROFTA</w:t>
+        <w:t xml:space="preserve">ARLEKIN RAVENSCROFTA</w:t>
       </w:r>
     </w:p>
     <w:p>
@@ -3058,7 +3058,7 @@
         <w:pStyle w:val="Heading1"/>
       </w:pPr>
       <w:r>
-        <w:t xml:space="preserve">6. STUDIUM PRZYPADKU:</w:t>
+        <w:t xml:space="preserve">STUDIUM PRZYPADKU:</w:t>
       </w:r>
       <w:r>
         <w:t xml:space="preserve"> </w:t>
@@ -3741,7 +3741,7 @@
         <w:pStyle w:val="Heading1"/>
       </w:pPr>
       <w:r>
-        <w:t xml:space="preserve">7. ZAKOŃCZENIE: WIDOK Z MIELIZN</w:t>
+        <w:t xml:space="preserve">ZAKOŃCZENIE: WIDOK Z MIELIZN</w:t>
       </w:r>
     </w:p>
     <w:p>

</xml_diff>